<commit_message>
Huacho: firma insertada en las cartas y paquetes regenerados
Co-Authored-By: Claude Opus 5.5 <noreply@anthropic.com>
Claude-Session: https://claude.ai/code/session_01Ls5dNjYBLNjXxuGTDk7v3H
</commit_message>
<xml_diff>
--- a/carta-reclamo/Carta_Reclamo_Pago_Huacho_ABS_VIRTUAL.docx
+++ b/carta-reclamo/Carta_Reclamo_Pago_Huacho_ABS_VIRTUAL.docx
@@ -3028,7 +3028,7 @@
       </w:r>
     </w:p>
     <w:bookmarkEnd w:id="24"/>
-    <w:bookmarkStart w:id="49" w:name="reserva-de-acciones"/>
+    <w:bookmarkStart w:id="52" w:name="reserva-de-acciones"/>
     <w:p>
       <w:pPr>
         <w:pStyle w:val="Heading2"/>
@@ -3325,334 +3325,359 @@
         <w:pStyle w:val="BodyText"/>
       </w:pPr>
       <w:r>
-        <w:t xml:space="preserve"> </w:t>
-      </w:r>
-    </w:p>
-    <w:p>
-      <w:pPr>
-        <w:pStyle w:val="BodyText"/>
-      </w:pPr>
-      <w:r>
-        <w:t xml:space="preserve"> </w:t>
-      </w:r>
-    </w:p>
-    <w:p>
-      <w:pPr>
-        <w:pStyle w:val="BodyText"/>
-      </w:pPr>
-      <w:r>
-        <w:t xml:space="preserve">___________________________________</w:t>
-      </w:r>
-      <w:r>
-        <w:br/>
-      </w:r>
-      <w:r>
-        <w:rPr>
-          <w:bCs/>
-          <w:b/>
-        </w:rPr>
-        <w:t xml:space="preserve">ABBY GABRIELA BUENO SALDAÑA</w:t>
-      </w:r>
-      <w:r>
-        <w:br/>
-      </w:r>
-      <w:r>
-        <w:t xml:space="preserve">DNI N.° 48054321</w:t>
-      </w:r>
-      <w:r>
-        <w:br/>
-      </w:r>
-      <w:r>
-        <w:t xml:space="preserve">Titular Gerente</w:t>
-      </w:r>
-      <w:r>
-        <w:br/>
-      </w:r>
-      <w:r>
-        <w:rPr>
-          <w:bCs/>
-          <w:b/>
-        </w:rPr>
-        <w:t xml:space="preserve">ABS BIENES &amp; SERVICIOS E.I.R.L.</w:t>
-      </w:r>
-      <w:r>
-        <w:t xml:space="preserve"> </w:t>
-      </w:r>
-      <w:r>
-        <w:t xml:space="preserve">– RUC N.° 20608727583</w:t>
-      </w:r>
-      <w:r>
-        <w:br/>
-      </w:r>
-      <w:r>
-        <w:t xml:space="preserve">Domicilio: Calle Giuseppe Verdi N.° 951, Urb. Primavera, Trujillo, La Libertad</w:t>
-      </w:r>
-      <w:r>
-        <w:br/>
-      </w:r>
-      <w:r>
-        <w:t xml:space="preserve">Correo: abs.comercial2@gmail.com · Celular: 986045123</w:t>
-      </w:r>
-    </w:p>
-    <w:p>
-      <w:pPr>
-        <w:pStyle w:val="BodyText"/>
-      </w:pPr>
-      <w:r>
-        <w:rPr>
-          <w:bCs/>
-          <w:b/>
-        </w:rPr>
-        <w:t xml:space="preserve">C.c.:</w:t>
-      </w:r>
-      <w:r>
-        <w:br/>
-      </w:r>
-      <w:r>
-        <w:t xml:space="preserve">- Sra. Elizabeth Roxana Espinoza Collantes – Jefa de la Oficina General de Administración y Finanzas.</w:t>
-      </w:r>
-      <w:r>
-        <w:br/>
-      </w:r>
-      <w:r>
-        <w:t xml:space="preserve">- Sra. Milagros Mena Campos – Gerencia Municipal.</w:t>
-      </w:r>
-      <w:r>
-        <w:br/>
-      </w:r>
-      <w:r>
-        <w:t xml:space="preserve">- Sra. Wendy Lisbeth Huado Pichilingue – Jefa de la Oficina de Contabilidad.</w:t>
-      </w:r>
-      <w:r>
-        <w:br/>
-      </w:r>
-      <w:r>
-        <w:t xml:space="preserve">- Sra. Elizabeth Roxana Espinoza Collantes – Oficina de Tesorería.</w:t>
-      </w:r>
-      <w:r>
-        <w:br/>
-      </w:r>
-      <w:r>
-        <w:t xml:space="preserve">- Sr. Ronald David Claros Meza – Jefe de la Oficina de Abastecimiento.</w:t>
-      </w:r>
-      <w:r>
-        <w:br/>
-      </w:r>
-      <w:r>
-        <w:t xml:space="preserve">- Sra. Rosa Yesenia Aguilar Zelada – Jefa del Órgano de Control Institucional.</w:t>
-      </w:r>
-    </w:p>
-    <w:p>
-      <w:r>
-        <w:pict>
-          <v:rect style="width:0;height:1.5pt" o:hralign="center" o:hrstd="t" o:hr="t"/>
-        </w:pict>
-      </w:r>
-    </w:p>
-    <w:p>
-      <w:pPr>
-        <w:pStyle w:val="FirstParagraph"/>
-      </w:pPr>
-      <w:r>
-        <w:rPr>
-          <w:bCs/>
-          <w:b/>
-        </w:rPr>
-        <w:t xml:space="preserve">ANEXOS:</w:t>
-      </w:r>
-    </w:p>
-    <w:p>
-      <w:pPr>
-        <w:numPr>
-          <w:ilvl w:val="0"/>
-          <w:numId w:val="1007"/>
-        </w:numPr>
-        <w:pStyle w:val="Compact"/>
-      </w:pPr>
-      <w:r>
-        <w:rPr>
-          <w:bCs/>
-          <w:b/>
-        </w:rPr>
-        <w:t xml:space="preserve">Anexo 1:</w:t>
-      </w:r>
-      <w:r>
-        <w:t xml:space="preserve"> </w:t>
-      </w:r>
-      <w:r>
-        <w:t xml:space="preserve">Orden de Compra física N.° 000146 y OCAM-2022-301371-25-0.</w:t>
-      </w:r>
-    </w:p>
-    <w:p>
-      <w:pPr>
-        <w:numPr>
-          <w:ilvl w:val="0"/>
-          <w:numId w:val="1007"/>
-        </w:numPr>
-        <w:pStyle w:val="Compact"/>
-      </w:pPr>
-      <w:r>
-        <w:rPr>
-          <w:bCs/>
-          <w:b/>
-        </w:rPr>
-        <w:t xml:space="preserve">Anexo 2:</w:t>
-      </w:r>
-      <w:r>
-        <w:t xml:space="preserve"> </w:t>
-      </w:r>
-      <w:r>
-        <w:t xml:space="preserve">Guía de Remisión EG01-6, con sello de recepción de la Municipalidad.</w:t>
-      </w:r>
-    </w:p>
-    <w:p>
-      <w:pPr>
-        <w:numPr>
-          <w:ilvl w:val="0"/>
-          <w:numId w:val="1007"/>
-        </w:numPr>
-        <w:pStyle w:val="Compact"/>
-      </w:pPr>
-      <w:r>
-        <w:rPr>
-          <w:bCs/>
-          <w:b/>
-        </w:rPr>
-        <w:t xml:space="preserve">Anexo 3:</w:t>
-      </w:r>
-      <w:r>
-        <w:t xml:space="preserve"> </w:t>
-      </w:r>
-      <w:r>
-        <w:t xml:space="preserve">Factura Electrónica E001-17, por S/ 5,223.39.</w:t>
-      </w:r>
-    </w:p>
-    <w:p>
-      <w:pPr>
-        <w:numPr>
-          <w:ilvl w:val="0"/>
-          <w:numId w:val="1007"/>
-        </w:numPr>
-        <w:pStyle w:val="Compact"/>
-      </w:pPr>
-      <w:r>
-        <w:rPr>
-          <w:bCs/>
-          <w:b/>
-        </w:rPr>
-        <w:t xml:space="preserve">Anexo 4:</w:t>
-      </w:r>
-      <w:r>
-        <w:t xml:space="preserve"> </w:t>
-      </w:r>
-      <w:r>
-        <w:t xml:space="preserve">Carta de autorización para el pago con abono en cuenta (CCI).</w:t>
-      </w:r>
-    </w:p>
-    <w:p>
-      <w:pPr>
-        <w:numPr>
-          <w:ilvl w:val="0"/>
-          <w:numId w:val="1007"/>
-        </w:numPr>
-        <w:pStyle w:val="Compact"/>
-      </w:pPr>
-      <w:r>
-        <w:rPr>
-          <w:bCs/>
-          <w:b/>
-        </w:rPr>
-        <w:t xml:space="preserve">Anexo 5:</w:t>
-      </w:r>
-      <w:r>
-        <w:t xml:space="preserve"> </w:t>
-      </w:r>
-      <w:r>
-        <w:t xml:space="preserve">Consulta del Expediente SIAF N.° 3619-2022.</w:t>
-      </w:r>
-    </w:p>
-    <w:p>
-      <w:pPr>
-        <w:numPr>
-          <w:ilvl w:val="0"/>
-          <w:numId w:val="1007"/>
-        </w:numPr>
-        <w:pStyle w:val="Compact"/>
-      </w:pPr>
-      <w:r>
-        <w:rPr>
-          <w:bCs/>
-          <w:b/>
-        </w:rPr>
-        <w:t xml:space="preserve">Anexo 6:</w:t>
-      </w:r>
-      <w:r>
-        <w:t xml:space="preserve"> </w:t>
-      </w:r>
-      <w:r>
-        <w:t xml:space="preserve">Trámite del Expediente N.° 00655163 (Memorándum N.° 000836-MPH/GM y Proveído N.° 003811-MPH/OGAF).</w:t>
-      </w:r>
-    </w:p>
-    <w:p>
-      <w:pPr>
-        <w:numPr>
-          <w:ilvl w:val="0"/>
-          <w:numId w:val="1007"/>
-        </w:numPr>
-        <w:pStyle w:val="Compact"/>
-      </w:pPr>
-      <w:r>
-        <w:rPr>
-          <w:bCs/>
-          <w:b/>
-        </w:rPr>
-        <w:t xml:space="preserve">Anexo 7:</w:t>
-      </w:r>
-      <w:r>
-        <w:t xml:space="preserve"> </w:t>
-      </w:r>
-      <w:r>
-        <w:t xml:space="preserve">Oficio N.° 003413-2026-PERÚ COMPRAS-DCEME, del 21 de julio de 2026.</w:t>
-      </w:r>
-    </w:p>
-    <w:p>
-      <w:pPr>
-        <w:pStyle w:val="FirstParagraph"/>
-      </w:pPr>
-      <w:r>
-        <w:rPr>
-          <w:iCs/>
-          <w:i/>
-        </w:rPr>
-        <w:t xml:space="preserve">Nota: Por disposición de la Directiva N.° 01-2021-MPH, se adjuntan solo los anexos principales (máximo 20 folios). Los demás documentos citados ya obran en poder de la Municipalidad: nuestras Cartas N.° 355-2026 y N.° 356-2026, y los Oficios N.° 12475-2023 y N.° 006119-2024-PERÚ COMPRAS-DAM, dirigidos a la Oficina General de Administración y Finanzas. Los presentaremos nuevamente si su despacho lo requiere.</w:t>
-      </w:r>
-    </w:p>
-    <w:p>
-      <w:r>
-        <w:br w:type="page"/>
-      </w:r>
-    </w:p>
-    <w:p>
-      <w:pPr>
-        <w:pStyle w:val="BodyText"/>
-      </w:pPr>
-      <w:r>
         <w:drawing>
           <wp:inline>
-            <wp:extent cx="5334000" cy="7532076"/>
+            <wp:extent cx="2159999" cy="991189"/>
             <wp:effectExtent b="0" l="0" r="0" t="0"/>
             <wp:docPr descr="" title="" id="26" name="Picture"/>
             <a:graphic>
               <a:graphicData uri="http://schemas.openxmlformats.org/drawingml/2006/picture">
                 <pic:pic>
                   <pic:nvPicPr>
-                    <pic:cNvPr descr="anexos_huacho/p4.png" id="27" name="Picture"/>
+                    <pic:cNvPr descr="firma_abs.png" id="27" name="Picture"/>
                     <pic:cNvPicPr>
                       <a:picLocks noChangeArrowheads="1" noChangeAspect="1"/>
                     </pic:cNvPicPr>
                   </pic:nvPicPr>
                   <pic:blipFill>
                     <a:blip r:embed="rId25"/>
+                    <a:stretch>
+                      <a:fillRect/>
+                    </a:stretch>
+                  </pic:blipFill>
+                  <pic:spPr bwMode="auto">
+                    <a:xfrm>
+                      <a:off x="0" y="0"/>
+                      <a:ext cx="2159999" cy="991189"/>
+                    </a:xfrm>
+                    <a:prstGeom prst="rect">
+                      <a:avLst/>
+                    </a:prstGeom>
+                    <a:noFill/>
+                    <a:ln w="9525">
+                      <a:noFill/>
+                      <a:headEnd/>
+                      <a:tailEnd/>
+                    </a:ln>
+                  </pic:spPr>
+                </pic:pic>
+              </a:graphicData>
+            </a:graphic>
+          </wp:inline>
+        </w:drawing>
+      </w:r>
+    </w:p>
+    <w:p>
+      <w:pPr>
+        <w:pStyle w:val="BodyText"/>
+      </w:pPr>
+      <w:r>
+        <w:rPr>
+          <w:bCs/>
+          <w:b/>
+        </w:rPr>
+        <w:t xml:space="preserve">ABBY GABRIELA BUENO SALDAÑA</w:t>
+      </w:r>
+      <w:r>
+        <w:br/>
+      </w:r>
+      <w:r>
+        <w:t xml:space="preserve">DNI N.° 48054321</w:t>
+      </w:r>
+      <w:r>
+        <w:br/>
+      </w:r>
+      <w:r>
+        <w:t xml:space="preserve">Titular Gerente</w:t>
+      </w:r>
+      <w:r>
+        <w:br/>
+      </w:r>
+      <w:r>
+        <w:rPr>
+          <w:bCs/>
+          <w:b/>
+        </w:rPr>
+        <w:t xml:space="preserve">ABS BIENES &amp; SERVICIOS E.I.R.L.</w:t>
+      </w:r>
+      <w:r>
+        <w:t xml:space="preserve"> </w:t>
+      </w:r>
+      <w:r>
+        <w:t xml:space="preserve">– RUC N.° 20608727583</w:t>
+      </w:r>
+      <w:r>
+        <w:br/>
+      </w:r>
+      <w:r>
+        <w:t xml:space="preserve">Domicilio: Calle Giuseppe Verdi N.° 951, Urb. Primavera, Trujillo, La Libertad</w:t>
+      </w:r>
+      <w:r>
+        <w:br/>
+      </w:r>
+      <w:r>
+        <w:t xml:space="preserve">Correo: abs.comercial2@gmail.com · Celular: 986045123</w:t>
+      </w:r>
+    </w:p>
+    <w:p>
+      <w:pPr>
+        <w:pStyle w:val="BodyText"/>
+      </w:pPr>
+      <w:r>
+        <w:rPr>
+          <w:bCs/>
+          <w:b/>
+        </w:rPr>
+        <w:t xml:space="preserve">C.c.:</w:t>
+      </w:r>
+      <w:r>
+        <w:br/>
+      </w:r>
+      <w:r>
+        <w:t xml:space="preserve">- Sra. Elizabeth Roxana Espinoza Collantes – Jefa de la Oficina General de Administración y Finanzas.</w:t>
+      </w:r>
+      <w:r>
+        <w:br/>
+      </w:r>
+      <w:r>
+        <w:t xml:space="preserve">- Sra. Milagros Mena Campos – Gerencia Municipal.</w:t>
+      </w:r>
+      <w:r>
+        <w:br/>
+      </w:r>
+      <w:r>
+        <w:t xml:space="preserve">- Sra. Wendy Lisbeth Huado Pichilingue – Jefa de la Oficina de Contabilidad.</w:t>
+      </w:r>
+      <w:r>
+        <w:br/>
+      </w:r>
+      <w:r>
+        <w:t xml:space="preserve">- Sra. Elizabeth Roxana Espinoza Collantes – Oficina de Tesorería.</w:t>
+      </w:r>
+      <w:r>
+        <w:br/>
+      </w:r>
+      <w:r>
+        <w:t xml:space="preserve">- Sr. Ronald David Claros Meza – Jefe de la Oficina de Abastecimiento.</w:t>
+      </w:r>
+      <w:r>
+        <w:br/>
+      </w:r>
+      <w:r>
+        <w:t xml:space="preserve">- Sra. Rosa Yesenia Aguilar Zelada – Jefa del Órgano de Control Institucional.</w:t>
+      </w:r>
+    </w:p>
+    <w:p>
+      <w:r>
+        <w:pict>
+          <v:rect style="width:0;height:1.5pt" o:hralign="center" o:hrstd="t" o:hr="t"/>
+        </w:pict>
+      </w:r>
+    </w:p>
+    <w:p>
+      <w:pPr>
+        <w:pStyle w:val="FirstParagraph"/>
+      </w:pPr>
+      <w:r>
+        <w:rPr>
+          <w:bCs/>
+          <w:b/>
+        </w:rPr>
+        <w:t xml:space="preserve">ANEXOS:</w:t>
+      </w:r>
+    </w:p>
+    <w:p>
+      <w:pPr>
+        <w:numPr>
+          <w:ilvl w:val="0"/>
+          <w:numId w:val="1007"/>
+        </w:numPr>
+        <w:pStyle w:val="Compact"/>
+      </w:pPr>
+      <w:r>
+        <w:rPr>
+          <w:bCs/>
+          <w:b/>
+        </w:rPr>
+        <w:t xml:space="preserve">Anexo 1:</w:t>
+      </w:r>
+      <w:r>
+        <w:t xml:space="preserve"> </w:t>
+      </w:r>
+      <w:r>
+        <w:t xml:space="preserve">Orden de Compra física N.° 000146 y OCAM-2022-301371-25-0.</w:t>
+      </w:r>
+    </w:p>
+    <w:p>
+      <w:pPr>
+        <w:numPr>
+          <w:ilvl w:val="0"/>
+          <w:numId w:val="1007"/>
+        </w:numPr>
+        <w:pStyle w:val="Compact"/>
+      </w:pPr>
+      <w:r>
+        <w:rPr>
+          <w:bCs/>
+          <w:b/>
+        </w:rPr>
+        <w:t xml:space="preserve">Anexo 2:</w:t>
+      </w:r>
+      <w:r>
+        <w:t xml:space="preserve"> </w:t>
+      </w:r>
+      <w:r>
+        <w:t xml:space="preserve">Guía de Remisión EG01-6, con sello de recepción de la Municipalidad.</w:t>
+      </w:r>
+    </w:p>
+    <w:p>
+      <w:pPr>
+        <w:numPr>
+          <w:ilvl w:val="0"/>
+          <w:numId w:val="1007"/>
+        </w:numPr>
+        <w:pStyle w:val="Compact"/>
+      </w:pPr>
+      <w:r>
+        <w:rPr>
+          <w:bCs/>
+          <w:b/>
+        </w:rPr>
+        <w:t xml:space="preserve">Anexo 3:</w:t>
+      </w:r>
+      <w:r>
+        <w:t xml:space="preserve"> </w:t>
+      </w:r>
+      <w:r>
+        <w:t xml:space="preserve">Factura Electrónica E001-17, por S/ 5,223.39.</w:t>
+      </w:r>
+    </w:p>
+    <w:p>
+      <w:pPr>
+        <w:numPr>
+          <w:ilvl w:val="0"/>
+          <w:numId w:val="1007"/>
+        </w:numPr>
+        <w:pStyle w:val="Compact"/>
+      </w:pPr>
+      <w:r>
+        <w:rPr>
+          <w:bCs/>
+          <w:b/>
+        </w:rPr>
+        <w:t xml:space="preserve">Anexo 4:</w:t>
+      </w:r>
+      <w:r>
+        <w:t xml:space="preserve"> </w:t>
+      </w:r>
+      <w:r>
+        <w:t xml:space="preserve">Carta de autorización para el pago con abono en cuenta (CCI).</w:t>
+      </w:r>
+    </w:p>
+    <w:p>
+      <w:pPr>
+        <w:numPr>
+          <w:ilvl w:val="0"/>
+          <w:numId w:val="1007"/>
+        </w:numPr>
+        <w:pStyle w:val="Compact"/>
+      </w:pPr>
+      <w:r>
+        <w:rPr>
+          <w:bCs/>
+          <w:b/>
+        </w:rPr>
+        <w:t xml:space="preserve">Anexo 5:</w:t>
+      </w:r>
+      <w:r>
+        <w:t xml:space="preserve"> </w:t>
+      </w:r>
+      <w:r>
+        <w:t xml:space="preserve">Consulta del Expediente SIAF N.° 3619-2022.</w:t>
+      </w:r>
+    </w:p>
+    <w:p>
+      <w:pPr>
+        <w:numPr>
+          <w:ilvl w:val="0"/>
+          <w:numId w:val="1007"/>
+        </w:numPr>
+        <w:pStyle w:val="Compact"/>
+      </w:pPr>
+      <w:r>
+        <w:rPr>
+          <w:bCs/>
+          <w:b/>
+        </w:rPr>
+        <w:t xml:space="preserve">Anexo 6:</w:t>
+      </w:r>
+      <w:r>
+        <w:t xml:space="preserve"> </w:t>
+      </w:r>
+      <w:r>
+        <w:t xml:space="preserve">Trámite del Expediente N.° 00655163 (Memorándum N.° 000836-MPH/GM y Proveído N.° 003811-MPH/OGAF).</w:t>
+      </w:r>
+    </w:p>
+    <w:p>
+      <w:pPr>
+        <w:numPr>
+          <w:ilvl w:val="0"/>
+          <w:numId w:val="1007"/>
+        </w:numPr>
+        <w:pStyle w:val="Compact"/>
+      </w:pPr>
+      <w:r>
+        <w:rPr>
+          <w:bCs/>
+          <w:b/>
+        </w:rPr>
+        <w:t xml:space="preserve">Anexo 7:</w:t>
+      </w:r>
+      <w:r>
+        <w:t xml:space="preserve"> </w:t>
+      </w:r>
+      <w:r>
+        <w:t xml:space="preserve">Oficio N.° 003413-2026-PERÚ COMPRAS-DCEME, del 21 de julio de 2026.</w:t>
+      </w:r>
+    </w:p>
+    <w:p>
+      <w:pPr>
+        <w:pStyle w:val="FirstParagraph"/>
+      </w:pPr>
+      <w:r>
+        <w:rPr>
+          <w:iCs/>
+          <w:i/>
+        </w:rPr>
+        <w:t xml:space="preserve">Nota: Por disposición de la Directiva N.° 01-2021-MPH, se adjuntan solo los anexos principales (máximo 20 folios). Los demás documentos citados ya obran en poder de la Municipalidad: nuestras Cartas N.° 355-2026 y N.° 356-2026, y los Oficios N.° 12475-2023 y N.° 006119-2024-PERÚ COMPRAS-DAM, dirigidos a la Oficina General de Administración y Finanzas. Los presentaremos nuevamente si su despacho lo requiere.</w:t>
+      </w:r>
+    </w:p>
+    <w:p>
+      <w:r>
+        <w:br w:type="page"/>
+      </w:r>
+    </w:p>
+    <w:p>
+      <w:pPr>
+        <w:pStyle w:val="BodyText"/>
+      </w:pPr>
+      <w:r>
+        <w:drawing>
+          <wp:inline>
+            <wp:extent cx="5334000" cy="7532076"/>
+            <wp:effectExtent b="0" l="0" r="0" t="0"/>
+            <wp:docPr descr="" title="" id="29" name="Picture"/>
+            <a:graphic>
+              <a:graphicData uri="http://schemas.openxmlformats.org/drawingml/2006/picture">
+                <pic:pic>
+                  <pic:nvPicPr>
+                    <pic:cNvPr descr="anexos_huacho/p4.png" id="30" name="Picture"/>
+                    <pic:cNvPicPr>
+                      <a:picLocks noChangeArrowheads="1" noChangeAspect="1"/>
+                    </pic:cNvPicPr>
+                  </pic:nvPicPr>
+                  <pic:blipFill>
+                    <a:blip r:embed="rId28"/>
                     <a:stretch>
                       <a:fillRect/>
                     </a:stretch>
@@ -3705,18 +3730,18 @@
           <wp:inline>
             <wp:extent cx="4679999" cy="6608571"/>
             <wp:effectExtent b="0" l="0" r="0" t="0"/>
-            <wp:docPr descr="" title="" id="29" name="Picture"/>
+            <wp:docPr descr="" title="" id="32" name="Picture"/>
             <a:graphic>
               <a:graphicData uri="http://schemas.openxmlformats.org/drawingml/2006/picture">
                 <pic:pic>
                   <pic:nvPicPr>
-                    <pic:cNvPr descr="anexos_huacho/p2.png" id="30" name="Picture"/>
+                    <pic:cNvPr descr="anexos_huacho/p2.png" id="33" name="Picture"/>
                     <pic:cNvPicPr>
                       <a:picLocks noChangeArrowheads="1" noChangeAspect="1"/>
                     </pic:cNvPicPr>
                   </pic:nvPicPr>
                   <pic:blipFill>
-                    <a:blip r:embed="rId28"/>
+                    <a:blip r:embed="rId31"/>
                     <a:stretch>
                       <a:fillRect/>
                     </a:stretch>
@@ -3769,18 +3794,18 @@
           <wp:inline>
             <wp:extent cx="5334000" cy="7532076"/>
             <wp:effectExtent b="0" l="0" r="0" t="0"/>
-            <wp:docPr descr="" title="" id="32" name="Picture"/>
+            <wp:docPr descr="" title="" id="35" name="Picture"/>
             <a:graphic>
               <a:graphicData uri="http://schemas.openxmlformats.org/drawingml/2006/picture">
                 <pic:pic>
                   <pic:nvPicPr>
-                    <pic:cNvPr descr="anexos_huacho/p3.png" id="33" name="Picture"/>
+                    <pic:cNvPr descr="anexos_huacho/p3.png" id="36" name="Picture"/>
                     <pic:cNvPicPr>
                       <a:picLocks noChangeArrowheads="1" noChangeAspect="1"/>
                     </pic:cNvPicPr>
                   </pic:nvPicPr>
                   <pic:blipFill>
-                    <a:blip r:embed="rId31"/>
+                    <a:blip r:embed="rId34"/>
                     <a:stretch>
                       <a:fillRect/>
                     </a:stretch>
@@ -3833,18 +3858,18 @@
           <wp:inline>
             <wp:extent cx="4679999" cy="6608571"/>
             <wp:effectExtent b="0" l="0" r="0" t="0"/>
-            <wp:docPr descr="" title="" id="35" name="Picture"/>
+            <wp:docPr descr="" title="" id="38" name="Picture"/>
             <a:graphic>
               <a:graphicData uri="http://schemas.openxmlformats.org/drawingml/2006/picture">
                 <pic:pic>
                   <pic:nvPicPr>
-                    <pic:cNvPr descr="anexos_huacho/p7.png" id="36" name="Picture"/>
+                    <pic:cNvPr descr="anexos_huacho/p7.png" id="39" name="Picture"/>
                     <pic:cNvPicPr>
                       <a:picLocks noChangeArrowheads="1" noChangeAspect="1"/>
                     </pic:cNvPicPr>
                   </pic:nvPicPr>
                   <pic:blipFill>
-                    <a:blip r:embed="rId34"/>
+                    <a:blip r:embed="rId37"/>
                     <a:stretch>
                       <a:fillRect/>
                     </a:stretch>
@@ -3897,18 +3922,18 @@
           <wp:inline>
             <wp:extent cx="5334000" cy="7532076"/>
             <wp:effectExtent b="0" l="0" r="0" t="0"/>
-            <wp:docPr descr="" title="" id="38" name="Picture"/>
+            <wp:docPr descr="" title="" id="41" name="Picture"/>
             <a:graphic>
               <a:graphicData uri="http://schemas.openxmlformats.org/drawingml/2006/picture">
                 <pic:pic>
                   <pic:nvPicPr>
-                    <pic:cNvPr descr="anexos_huacho/p8.png" id="39" name="Picture"/>
+                    <pic:cNvPr descr="anexos_huacho/p8.png" id="42" name="Picture"/>
                     <pic:cNvPicPr>
                       <a:picLocks noChangeArrowheads="1" noChangeAspect="1"/>
                     </pic:cNvPicPr>
                   </pic:nvPicPr>
                   <pic:blipFill>
-                    <a:blip r:embed="rId37"/>
+                    <a:blip r:embed="rId40"/>
                     <a:stretch>
                       <a:fillRect/>
                     </a:stretch>
@@ -3961,18 +3986,18 @@
           <wp:inline>
             <wp:extent cx="4679999" cy="6608571"/>
             <wp:effectExtent b="0" l="0" r="0" t="0"/>
-            <wp:docPr descr="" title="" id="41" name="Picture"/>
+            <wp:docPr descr="" title="" id="44" name="Picture"/>
             <a:graphic>
               <a:graphicData uri="http://schemas.openxmlformats.org/drawingml/2006/picture">
                 <pic:pic>
                   <pic:nvPicPr>
-                    <pic:cNvPr descr="anexos_huacho/p9.png" id="42" name="Picture"/>
+                    <pic:cNvPr descr="anexos_huacho/p9.png" id="45" name="Picture"/>
                     <pic:cNvPicPr>
                       <a:picLocks noChangeArrowheads="1" noChangeAspect="1"/>
                     </pic:cNvPicPr>
                   </pic:nvPicPr>
                   <pic:blipFill>
-                    <a:blip r:embed="rId40"/>
+                    <a:blip r:embed="rId43"/>
                     <a:stretch>
                       <a:fillRect/>
                     </a:stretch>
@@ -4053,76 +4078,12 @@
           <wp:inline>
             <wp:extent cx="4679999" cy="6618857"/>
             <wp:effectExtent b="0" l="0" r="0" t="0"/>
-            <wp:docPr descr="" title="" id="44" name="Picture"/>
-            <a:graphic>
-              <a:graphicData uri="http://schemas.openxmlformats.org/drawingml/2006/picture">
-                <pic:pic>
-                  <pic:nvPicPr>
-                    <pic:cNvPr descr="anexos_huacho/ag2.png" id="45" name="Picture"/>
-                    <pic:cNvPicPr>
-                      <a:picLocks noChangeArrowheads="1" noChangeAspect="1"/>
-                    </pic:cNvPicPr>
-                  </pic:nvPicPr>
-                  <pic:blipFill>
-                    <a:blip r:embed="rId43"/>
-                    <a:stretch>
-                      <a:fillRect/>
-                    </a:stretch>
-                  </pic:blipFill>
-                  <pic:spPr bwMode="auto">
-                    <a:xfrm>
-                      <a:off x="0" y="0"/>
-                      <a:ext cx="4679999" cy="6618857"/>
-                    </a:xfrm>
-                    <a:prstGeom prst="rect">
-                      <a:avLst/>
-                    </a:prstGeom>
-                    <a:noFill/>
-                    <a:ln w="9525">
-                      <a:noFill/>
-                      <a:headEnd/>
-                      <a:tailEnd/>
-                    </a:ln>
-                  </pic:spPr>
-                </pic:pic>
-              </a:graphicData>
-            </a:graphic>
-          </wp:inline>
-        </w:drawing>
-      </w:r>
-    </w:p>
-    <w:p>
-      <w:pPr>
-        <w:pStyle w:val="BodyText"/>
-      </w:pPr>
-      <w:r>
-        <w:rPr>
-          <w:bCs/>
-          <w:b/>
-        </w:rPr>
-        <w:t xml:space="preserve">Anexo 7 – Oficio N.° 003413-2026-PERÚ COMPRAS-DCEME, del 21/07/2026 (pág. 1).</w:t>
-      </w:r>
-    </w:p>
-    <w:p>
-      <w:r>
-        <w:br w:type="page"/>
-      </w:r>
-    </w:p>
-    <w:p>
-      <w:pPr>
-        <w:pStyle w:val="BodyText"/>
-      </w:pPr>
-      <w:r>
-        <w:drawing>
-          <wp:inline>
-            <wp:extent cx="4679999" cy="6618857"/>
-            <wp:effectExtent b="0" l="0" r="0" t="0"/>
             <wp:docPr descr="" title="" id="47" name="Picture"/>
             <a:graphic>
               <a:graphicData uri="http://schemas.openxmlformats.org/drawingml/2006/picture">
                 <pic:pic>
                   <pic:nvPicPr>
-                    <pic:cNvPr descr="anexos_huacho/ag3.png" id="48" name="Picture"/>
+                    <pic:cNvPr descr="anexos_huacho/ag2.png" id="48" name="Picture"/>
                     <pic:cNvPicPr>
                       <a:picLocks noChangeArrowheads="1" noChangeAspect="1"/>
                     </pic:cNvPicPr>
@@ -4164,6 +4125,70 @@
           <w:bCs/>
           <w:b/>
         </w:rPr>
+        <w:t xml:space="preserve">Anexo 7 – Oficio N.° 003413-2026-PERÚ COMPRAS-DCEME, del 21/07/2026 (pág. 1).</w:t>
+      </w:r>
+    </w:p>
+    <w:p>
+      <w:r>
+        <w:br w:type="page"/>
+      </w:r>
+    </w:p>
+    <w:p>
+      <w:pPr>
+        <w:pStyle w:val="BodyText"/>
+      </w:pPr>
+      <w:r>
+        <w:drawing>
+          <wp:inline>
+            <wp:extent cx="4679999" cy="6618857"/>
+            <wp:effectExtent b="0" l="0" r="0" t="0"/>
+            <wp:docPr descr="" title="" id="50" name="Picture"/>
+            <a:graphic>
+              <a:graphicData uri="http://schemas.openxmlformats.org/drawingml/2006/picture">
+                <pic:pic>
+                  <pic:nvPicPr>
+                    <pic:cNvPr descr="anexos_huacho/ag3.png" id="51" name="Picture"/>
+                    <pic:cNvPicPr>
+                      <a:picLocks noChangeArrowheads="1" noChangeAspect="1"/>
+                    </pic:cNvPicPr>
+                  </pic:nvPicPr>
+                  <pic:blipFill>
+                    <a:blip r:embed="rId49"/>
+                    <a:stretch>
+                      <a:fillRect/>
+                    </a:stretch>
+                  </pic:blipFill>
+                  <pic:spPr bwMode="auto">
+                    <a:xfrm>
+                      <a:off x="0" y="0"/>
+                      <a:ext cx="4679999" cy="6618857"/>
+                    </a:xfrm>
+                    <a:prstGeom prst="rect">
+                      <a:avLst/>
+                    </a:prstGeom>
+                    <a:noFill/>
+                    <a:ln w="9525">
+                      <a:noFill/>
+                      <a:headEnd/>
+                      <a:tailEnd/>
+                    </a:ln>
+                  </pic:spPr>
+                </pic:pic>
+              </a:graphicData>
+            </a:graphic>
+          </wp:inline>
+        </w:drawing>
+      </w:r>
+    </w:p>
+    <w:p>
+      <w:pPr>
+        <w:pStyle w:val="BodyText"/>
+      </w:pPr>
+      <w:r>
+        <w:rPr>
+          <w:bCs/>
+          <w:b/>
+        </w:rPr>
         <w:t xml:space="preserve">Anexo 7 (cont.) – PERÚ COMPRAS constata el estado</w:t>
       </w:r>
       <w:r>
@@ -4202,7 +4227,7 @@
         <w:t xml:space="preserve">, corrobora el incumplimiento de la Municipalidad y lo traslada al OCI, con copia al Alcalde.</w:t>
       </w:r>
     </w:p>
-    <w:bookmarkEnd w:id="49"/>
+    <w:bookmarkEnd w:id="52"/>
     <w:sectPr/>
   </w:body>
 </w:document>

</xml_diff>